<commit_message>
Updated the Test report
</commit_message>
<xml_diff>
--- a/Evidence/Scroll Position and Hash Links During Enhanced Navigation.docx
+++ b/Evidence/Scroll Position and Hash Links During Enhanced Navigation.docx
@@ -133,6 +133,48 @@
       <w:r>
         <w:t> </w:t>
       </w:r>
+      <w:hyperlink r:id="rId7" w:history="1">
+        <w:proofErr w:type="spellStart"/>
+        <w:r>
+          <w:rPr>
+            <w:rStyle w:val="Hyperlink"/>
+          </w:rPr>
+          <w:t>BrundhaVelusamy</w:t>
+        </w:r>
+        <w:proofErr w:type="spellEnd"/>
+        <w:r>
+          <w:rPr>
+            <w:rStyle w:val="Hyperlink"/>
+          </w:rPr>
+          <w:t>/</w:t>
+        </w:r>
+        <w:proofErr w:type="spellStart"/>
+        <w:r>
+          <w:rPr>
+            <w:rStyle w:val="Hyperlink"/>
+          </w:rPr>
+          <w:t>EnhancedN</w:t>
+        </w:r>
+        <w:r>
+          <w:rPr>
+            <w:rStyle w:val="Hyperlink"/>
+          </w:rPr>
+          <w:t>a</w:t>
+        </w:r>
+        <w:r>
+          <w:rPr>
+            <w:rStyle w:val="Hyperlink"/>
+          </w:rPr>
+          <w:t>vigationScrollTesting</w:t>
+        </w:r>
+        <w:proofErr w:type="spellEnd"/>
+        <w:r>
+          <w:rPr>
+            <w:rStyle w:val="Hyperlink"/>
+          </w:rPr>
+          <w:t xml:space="preserve"> </w:t>
+        </w:r>
+      </w:hyperlink>
     </w:p>
     <w:p>
       <w:pPr>
@@ -1809,6 +1851,22 @@
         </w:rPr>
         <w:t xml:space="preserve">: </w:t>
       </w:r>
+      <w:hyperlink r:id="rId8" w:history="1">
+        <w:proofErr w:type="spellStart"/>
+        <w:r>
+          <w:rPr>
+            <w:rStyle w:val="Hyperlink"/>
+          </w:rPr>
+          <w:t>EnhancedNavigationScrollTesting</w:t>
+        </w:r>
+        <w:proofErr w:type="spellEnd"/>
+        <w:r>
+          <w:rPr>
+            <w:rStyle w:val="Hyperlink"/>
+          </w:rPr>
+          <w:t xml:space="preserve">/Evidence </w:t>
+        </w:r>
+      </w:hyperlink>
     </w:p>
     <w:p>
       <w:r>
@@ -1866,7 +1924,7 @@
       </w:r>
     </w:p>
     <w:sectPr>
-      <w:headerReference w:type="default" r:id="rId7"/>
+      <w:headerReference w:type="default" r:id="rId9"/>
       <w:pgSz w:w="12240" w:h="15840"/>
       <w:pgMar w:top="1440" w:right="1440" w:bottom="1440" w:left="1440" w:header="0" w:footer="720" w:gutter="0"/>
       <w:cols w:space="720"/>
@@ -3016,6 +3074,41 @@
     <w:uiPriority w:val="99"/>
     <w:rsid w:val="00DD7970"/>
   </w:style>
+  <w:style w:type="character" w:styleId="Hyperlink">
+    <w:name w:val="Hyperlink"/>
+    <w:basedOn w:val="DefaultParagraphFont"/>
+    <w:uiPriority w:val="99"/>
+    <w:unhideWhenUsed/>
+    <w:rsid w:val="00A647CD"/>
+    <w:rPr>
+      <w:color w:val="467886" w:themeColor="hyperlink"/>
+      <w:u w:val="single"/>
+    </w:rPr>
+  </w:style>
+  <w:style w:type="character" w:styleId="UnresolvedMention">
+    <w:name w:val="Unresolved Mention"/>
+    <w:basedOn w:val="DefaultParagraphFont"/>
+    <w:uiPriority w:val="99"/>
+    <w:semiHidden/>
+    <w:unhideWhenUsed/>
+    <w:rsid w:val="00A647CD"/>
+    <w:rPr>
+      <w:color w:val="605E5C"/>
+      <w:shd w:val="clear" w:color="auto" w:fill="E1DFDD"/>
+    </w:rPr>
+  </w:style>
+  <w:style w:type="character" w:styleId="FollowedHyperlink">
+    <w:name w:val="FollowedHyperlink"/>
+    <w:basedOn w:val="DefaultParagraphFont"/>
+    <w:uiPriority w:val="99"/>
+    <w:semiHidden/>
+    <w:unhideWhenUsed/>
+    <w:rsid w:val="00A647CD"/>
+    <w:rPr>
+      <w:color w:val="96607D" w:themeColor="followedHyperlink"/>
+      <w:u w:val="single"/>
+    </w:rPr>
+  </w:style>
 </w:styles>
 </file>
 

</xml_diff>

<commit_message>
Included the Test scenarios in document.
</commit_message>
<xml_diff>
--- a/Evidence/Scroll Position and Hash Links During Enhanced Navigation.docx
+++ b/Evidence/Scroll Position and Hash Links During Enhanced Navigation.docx
@@ -133,48 +133,46 @@
       <w:r>
         <w:t> </w:t>
       </w:r>
-      <w:hyperlink r:id="rId7" w:history="1">
-        <w:proofErr w:type="spellStart"/>
-        <w:r>
-          <w:rPr>
-            <w:rStyle w:val="Hyperlink"/>
-          </w:rPr>
-          <w:t>BrundhaVelusamy</w:t>
-        </w:r>
-        <w:proofErr w:type="spellEnd"/>
-        <w:r>
-          <w:rPr>
-            <w:rStyle w:val="Hyperlink"/>
-          </w:rPr>
-          <w:t>/</w:t>
-        </w:r>
-        <w:proofErr w:type="spellStart"/>
-        <w:r>
-          <w:rPr>
-            <w:rStyle w:val="Hyperlink"/>
-          </w:rPr>
-          <w:t>EnhancedN</w:t>
-        </w:r>
-        <w:r>
-          <w:rPr>
-            <w:rStyle w:val="Hyperlink"/>
-          </w:rPr>
-          <w:t>a</w:t>
-        </w:r>
-        <w:r>
-          <w:rPr>
-            <w:rStyle w:val="Hyperlink"/>
-          </w:rPr>
-          <w:t>vigationScrollTesting</w:t>
-        </w:r>
-        <w:proofErr w:type="spellEnd"/>
-        <w:r>
-          <w:rPr>
-            <w:rStyle w:val="Hyperlink"/>
-          </w:rPr>
-          <w:t xml:space="preserve"> </w:t>
-        </w:r>
-      </w:hyperlink>
+      <w:proofErr w:type="spellStart"/>
+      <w:r>
+        <w:fldChar w:fldCharType="begin"/>
+      </w:r>
+      <w:r>
+        <w:instrText>HYPERLINK "https://github.com/BrundhaVelusamy/EnhancedNavigationScrollTesting/tree/main"</w:instrText>
+      </w:r>
+      <w:r>
+        <w:fldChar w:fldCharType="separate"/>
+      </w:r>
+      <w:r>
+        <w:rPr>
+          <w:rStyle w:val="Hyperlink"/>
+        </w:rPr>
+        <w:t>BrundhaVelusamy</w:t>
+      </w:r>
+      <w:proofErr w:type="spellEnd"/>
+      <w:r>
+        <w:rPr>
+          <w:rStyle w:val="Hyperlink"/>
+        </w:rPr>
+        <w:t>/</w:t>
+      </w:r>
+      <w:proofErr w:type="spellStart"/>
+      <w:r>
+        <w:rPr>
+          <w:rStyle w:val="Hyperlink"/>
+        </w:rPr>
+        <w:t>EnhancedNavigationScrollTesting</w:t>
+      </w:r>
+      <w:proofErr w:type="spellEnd"/>
+      <w:r>
+        <w:rPr>
+          <w:rStyle w:val="Hyperlink"/>
+        </w:rPr>
+        <w:t xml:space="preserve"> </w:t>
+      </w:r>
+      <w:r>
+        <w:fldChar w:fldCharType="end"/>
+      </w:r>
     </w:p>
     <w:p>
       <w:pPr>
@@ -1825,7 +1823,240 @@
           </w:p>
         </w:tc>
       </w:tr>
+      <w:tr>
+        <w:tc>
+          <w:tcPr>
+            <w:tcW w:w="820" w:type="dxa"/>
+            <w:tcBorders>
+              <w:top w:val="single" w:sz="8" w:space="0" w:color="A3A3A3"/>
+              <w:left w:val="single" w:sz="8" w:space="0" w:color="A3A3A3"/>
+              <w:bottom w:val="single" w:sz="8" w:space="0" w:color="A3A3A3"/>
+              <w:right w:val="single" w:sz="8" w:space="0" w:color="A3A3A3"/>
+            </w:tcBorders>
+            <w:tcMar>
+              <w:top w:w="80" w:type="dxa"/>
+              <w:left w:w="80" w:type="dxa"/>
+              <w:bottom w:w="80" w:type="dxa"/>
+              <w:right w:w="80" w:type="dxa"/>
+            </w:tcMar>
+            <w:vAlign w:val="center"/>
+          </w:tcPr>
+          <w:p>
+            <w:pPr>
+              <w:jc w:val="center"/>
+            </w:pPr>
+            <w:r>
+              <w:t>16</w:t>
+            </w:r>
+          </w:p>
+        </w:tc>
+        <w:tc>
+          <w:tcPr>
+            <w:tcW w:w="4440" w:type="dxa"/>
+            <w:tcBorders>
+              <w:top w:val="single" w:sz="8" w:space="0" w:color="A3A3A3"/>
+              <w:left w:val="single" w:sz="8" w:space="0" w:color="A3A3A3"/>
+              <w:bottom w:val="single" w:sz="8" w:space="0" w:color="A3A3A3"/>
+              <w:right w:val="single" w:sz="8" w:space="0" w:color="A3A3A3"/>
+            </w:tcBorders>
+            <w:tcMar>
+              <w:top w:w="80" w:type="dxa"/>
+              <w:left w:w="80" w:type="dxa"/>
+              <w:bottom w:w="80" w:type="dxa"/>
+              <w:right w:w="80" w:type="dxa"/>
+            </w:tcMar>
+            <w:vAlign w:val="center"/>
+          </w:tcPr>
+          <w:p>
+            <w:r>
+              <w:t>Hash-only URL changes from the current page using standard enhanced navigation</w:t>
+            </w:r>
+          </w:p>
+        </w:tc>
+        <w:tc>
+          <w:tcPr>
+            <w:tcW w:w="1232" w:type="dxa"/>
+            <w:tcBorders>
+              <w:top w:val="single" w:sz="8" w:space="0" w:color="A3A3A3"/>
+              <w:left w:val="single" w:sz="8" w:space="0" w:color="A3A3A3"/>
+              <w:bottom w:val="single" w:sz="8" w:space="0" w:color="A3A3A3"/>
+              <w:right w:val="single" w:sz="8" w:space="0" w:color="A3A3A3"/>
+            </w:tcBorders>
+            <w:tcMar>
+              <w:top w:w="80" w:type="dxa"/>
+              <w:left w:w="80" w:type="dxa"/>
+              <w:bottom w:w="80" w:type="dxa"/>
+              <w:right w:w="80" w:type="dxa"/>
+            </w:tcMar>
+            <w:vAlign w:val="center"/>
+          </w:tcPr>
+          <w:p>
+            <w:r>
+              <w:t>Work Properly</w:t>
+            </w:r>
+          </w:p>
+        </w:tc>
+        <w:tc>
+          <w:tcPr>
+            <w:tcW w:w="2848" w:type="dxa"/>
+            <w:tcBorders>
+              <w:top w:val="single" w:sz="8" w:space="0" w:color="A3A3A3"/>
+              <w:left w:val="single" w:sz="8" w:space="0" w:color="A3A3A3"/>
+              <w:bottom w:val="single" w:sz="8" w:space="0" w:color="A3A3A3"/>
+              <w:right w:val="single" w:sz="8" w:space="0" w:color="A3A3A3"/>
+            </w:tcBorders>
+            <w:tcMar>
+              <w:top w:w="80" w:type="dxa"/>
+              <w:left w:w="80" w:type="dxa"/>
+              <w:bottom w:w="80" w:type="dxa"/>
+              <w:right w:w="80" w:type="dxa"/>
+            </w:tcMar>
+            <w:vAlign w:val="center"/>
+          </w:tcPr>
+          <w:p>
+            <w:r>
+              <w:t>Navigation landed on the target anchor within the same page.</w:t>
+            </w:r>
+          </w:p>
+        </w:tc>
+      </w:tr>
+      <w:tr>
+        <w:tc>
+          <w:tcPr>
+            <w:tcW w:w="820" w:type="dxa"/>
+            <w:tcBorders>
+              <w:top w:val="single" w:sz="8" w:space="0" w:color="A3A3A3"/>
+              <w:left w:val="single" w:sz="8" w:space="0" w:color="A3A3A3"/>
+              <w:bottom w:val="single" w:sz="8" w:space="0" w:color="A3A3A3"/>
+              <w:right w:val="single" w:sz="8" w:space="0" w:color="A3A3A3"/>
+            </w:tcBorders>
+            <w:tcMar>
+              <w:top w:w="80" w:type="dxa"/>
+              <w:left w:w="80" w:type="dxa"/>
+              <w:bottom w:w="80" w:type="dxa"/>
+              <w:right w:w="80" w:type="dxa"/>
+            </w:tcMar>
+            <w:vAlign w:val="center"/>
+          </w:tcPr>
+          <w:p>
+            <w:pPr>
+              <w:jc w:val="center"/>
+            </w:pPr>
+            <w:r>
+              <w:lastRenderedPageBreak/>
+              <w:t>17</w:t>
+            </w:r>
+          </w:p>
+        </w:tc>
+        <w:tc>
+          <w:tcPr>
+            <w:tcW w:w="4440" w:type="dxa"/>
+            <w:tcBorders>
+              <w:top w:val="single" w:sz="8" w:space="0" w:color="A3A3A3"/>
+              <w:left w:val="single" w:sz="8" w:space="0" w:color="A3A3A3"/>
+              <w:bottom w:val="single" w:sz="8" w:space="0" w:color="A3A3A3"/>
+              <w:right w:val="single" w:sz="8" w:space="0" w:color="A3A3A3"/>
+            </w:tcBorders>
+            <w:tcMar>
+              <w:top w:w="80" w:type="dxa"/>
+              <w:left w:w="80" w:type="dxa"/>
+              <w:bottom w:w="80" w:type="dxa"/>
+              <w:right w:w="80" w:type="dxa"/>
+            </w:tcMar>
+            <w:vAlign w:val="center"/>
+          </w:tcPr>
+          <w:p>
+            <w:r>
+              <w:t xml:space="preserve">Hash-only URL changes from the current page inside a </w:t>
+            </w:r>
+            <w:r>
+              <w:rPr>
+                <w:rStyle w:val="HTMLCode"/>
+                <w:rFonts w:asciiTheme="minorHAnsi" w:eastAsiaTheme="minorHAnsi" w:hAnsiTheme="minorHAnsi"/>
+                <w:sz w:val="24"/>
+                <w:szCs w:val="24"/>
+              </w:rPr>
+              <w:t>data-enhance-nav="false</w:t>
+            </w:r>
+            <w:r>
+              <w:rPr>
+                <w:rStyle w:val="HTMLCode"/>
+                <w:rFonts w:eastAsiaTheme="minorHAnsi"/>
+                <w:sz w:val="24"/>
+                <w:szCs w:val="24"/>
+              </w:rPr>
+              <w:t>"</w:t>
+            </w:r>
+            <w:r>
+              <w:rPr>
+                <w:sz w:val="32"/>
+                <w:szCs w:val="32"/>
+              </w:rPr>
+              <w:t xml:space="preserve"> </w:t>
+            </w:r>
+            <w:r>
+              <w:t>container</w:t>
+            </w:r>
+          </w:p>
+        </w:tc>
+        <w:tc>
+          <w:tcPr>
+            <w:tcW w:w="1232" w:type="dxa"/>
+            <w:tcBorders>
+              <w:top w:val="single" w:sz="8" w:space="0" w:color="A3A3A3"/>
+              <w:left w:val="single" w:sz="8" w:space="0" w:color="A3A3A3"/>
+              <w:bottom w:val="single" w:sz="8" w:space="0" w:color="A3A3A3"/>
+              <w:right w:val="single" w:sz="8" w:space="0" w:color="A3A3A3"/>
+            </w:tcBorders>
+            <w:tcMar>
+              <w:top w:w="80" w:type="dxa"/>
+              <w:left w:w="80" w:type="dxa"/>
+              <w:bottom w:w="80" w:type="dxa"/>
+              <w:right w:w="80" w:type="dxa"/>
+            </w:tcMar>
+            <w:vAlign w:val="center"/>
+          </w:tcPr>
+          <w:p>
+            <w:r>
+              <w:t>Work Properly</w:t>
+            </w:r>
+          </w:p>
+        </w:tc>
+        <w:tc>
+          <w:tcPr>
+            <w:tcW w:w="2848" w:type="dxa"/>
+            <w:tcBorders>
+              <w:top w:val="single" w:sz="8" w:space="0" w:color="A3A3A3"/>
+              <w:left w:val="single" w:sz="8" w:space="0" w:color="A3A3A3"/>
+              <w:bottom w:val="single" w:sz="8" w:space="0" w:color="A3A3A3"/>
+              <w:right w:val="single" w:sz="8" w:space="0" w:color="A3A3A3"/>
+            </w:tcBorders>
+            <w:tcMar>
+              <w:top w:w="80" w:type="dxa"/>
+              <w:left w:w="80" w:type="dxa"/>
+              <w:bottom w:w="80" w:type="dxa"/>
+              <w:right w:w="80" w:type="dxa"/>
+            </w:tcMar>
+            <w:vAlign w:val="center"/>
+          </w:tcPr>
+          <w:p>
+            <w:r>
+              <w:t>Browser performed native anchor navigation and navigated to the target section correctly.</w:t>
+            </w:r>
+          </w:p>
+        </w:tc>
+      </w:tr>
     </w:tbl>
+    <w:p>
+      <w:pPr>
+        <w:rPr>
+          <w:b/>
+          <w:bCs/>
+          <w:sz w:val="28"/>
+          <w:szCs w:val="28"/>
+        </w:rPr>
+      </w:pPr>
+    </w:p>
     <w:p>
       <w:pPr>
         <w:rPr>
@@ -1851,7 +2082,7 @@
         </w:rPr>
         <w:t xml:space="preserve">: </w:t>
       </w:r>
-      <w:hyperlink r:id="rId8" w:history="1">
+      <w:hyperlink r:id="rId7" w:history="1">
         <w:proofErr w:type="spellStart"/>
         <w:r>
           <w:rPr>
@@ -1924,7 +2155,7 @@
       </w:r>
     </w:p>
     <w:sectPr>
-      <w:headerReference w:type="default" r:id="rId9"/>
+      <w:headerReference w:type="default" r:id="rId8"/>
       <w:pgSz w:w="12240" w:h="15840"/>
       <w:pgMar w:top="1440" w:right="1440" w:bottom="1440" w:left="1440" w:header="0" w:footer="720" w:gutter="0"/>
       <w:cols w:space="720"/>
@@ -3109,6 +3340,19 @@
       <w:u w:val="single"/>
     </w:rPr>
   </w:style>
+  <w:style w:type="character" w:styleId="HTMLCode">
+    <w:name w:val="HTML Code"/>
+    <w:basedOn w:val="DefaultParagraphFont"/>
+    <w:uiPriority w:val="99"/>
+    <w:semiHidden/>
+    <w:unhideWhenUsed/>
+    <w:rsid w:val="00404C49"/>
+    <w:rPr>
+      <w:rFonts w:ascii="Courier New" w:eastAsia="Times New Roman" w:hAnsi="Courier New" w:cs="Courier New"/>
+      <w:sz w:val="20"/>
+      <w:szCs w:val="20"/>
+    </w:rPr>
+  </w:style>
 </w:styles>
 </file>
 

</xml_diff>